<commit_message>
Add Ono Academic College logo to homework document header
Co-Authored-By: Claude Fable 5 <noreply@anthropic.com>
Claude-Session: https://claude.ai/code/session_012TmCDya3CoN4WHPLaKiBXc
</commit_message>
<xml_diff>
--- a/עבודת בית בדיני קניין.docx
+++ b/עבודת בית בדיני קניין.docx
@@ -2,6 +2,52 @@
 <file path=word/document.xml><?xml version="1.0" encoding="utf-8"?>
 <w:document xmlns:wpc="http://schemas.microsoft.com/office/word/2010/wordprocessingCanvas" xmlns:mc="http://schemas.openxmlformats.org/markup-compatibility/2006" xmlns:o="urn:schemas-microsoft-com:office:office" xmlns:r="http://schemas.openxmlformats.org/officeDocument/2006/relationships" xmlns:m="http://schemas.openxmlformats.org/officeDocument/2006/math" xmlns:v="urn:schemas-microsoft-com:vml" xmlns:wp14="http://schemas.microsoft.com/office/word/2010/wordprocessingDrawing" xmlns:wp="http://schemas.openxmlformats.org/drawingml/2006/wordprocessingDrawing" xmlns:w10="urn:schemas-microsoft-com:office:word" xmlns:w="http://schemas.openxmlformats.org/wordprocessingml/2006/main" xmlns:w14="http://schemas.microsoft.com/office/word/2010/wordml" xmlns:w15="http://schemas.microsoft.com/office/word/2012/wordml" xmlns:wpg="http://schemas.microsoft.com/office/word/2010/wordprocessingGroup" xmlns:wpi="http://schemas.microsoft.com/office/word/2010/wordprocessingInk" xmlns:wne="http://schemas.microsoft.com/office/word/2006/wordml" xmlns:wps="http://schemas.microsoft.com/office/word/2010/wordprocessingShape" xmlns:cx="http://schemas.microsoft.com/office/drawing/2014/chartex" xmlns:cx1="http://schemas.microsoft.com/office/drawing/2015/9/8/chartex" xmlns:cx2="http://schemas.microsoft.com/office/drawing/2015/10/21/chartex" xmlns:cx3="http://schemas.microsoft.com/office/drawing/2016/5/9/chartex" xmlns:cx4="http://schemas.microsoft.com/office/drawing/2016/5/10/chartex" xmlns:cx5="http://schemas.microsoft.com/office/drawing/2016/5/11/chartex" xmlns:cx6="http://schemas.microsoft.com/office/drawing/2016/5/12/chartex" xmlns:cx7="http://schemas.microsoft.com/office/drawing/2016/5/13/chartex" xmlns:cx8="http://schemas.microsoft.com/office/drawing/2016/5/14/chartex" xmlns:aink="http://schemas.microsoft.com/office/drawing/2016/ink" xmlns:am3d="http://schemas.microsoft.com/office/drawing/2017/model3d" xmlns:w16cex="http://schemas.microsoft.com/office/word/2018/wordml/cex" xmlns:w16cid="http://schemas.microsoft.com/office/word/2016/wordml/cid" xmlns:w16="http://schemas.microsoft.com/office/word/2018/wordml" xmlns:w16sdtdh="http://schemas.microsoft.com/office/word/2020/wordml/sdtdatahash" xmlns:w16se="http://schemas.microsoft.com/office/word/2015/wordml/symex" mc:Ignorable="w14 w15 wp14">
   <w:body>
+    <w:p>
+      <w:pPr>
+        <w:spacing w:after="80"/>
+        <w:jc w:val="center"/>
+      </w:pPr>
+      <w:r>
+        <w:drawing>
+          <wp:inline distT="0" distB="0" distL="0" distR="0">
+            <wp:extent cx="1047750" cy="1047750"/>
+            <wp:effectExtent t="0" r="0" b="0" l="0"/>
+            <wp:docPr id="1" name="" descr="" title=""/>
+            <wp:cNvGraphicFramePr>
+              <a:graphicFrameLocks xmlns:a="http://schemas.openxmlformats.org/drawingml/2006/main" noChangeAspect="1"/>
+            </wp:cNvGraphicFramePr>
+            <a:graphic xmlns:a="http://schemas.openxmlformats.org/drawingml/2006/main">
+              <a:graphicData uri="http://schemas.openxmlformats.org/drawingml/2006/picture">
+                <pic:pic xmlns:pic="http://schemas.openxmlformats.org/drawingml/2006/picture">
+                  <pic:nvPicPr>
+                    <pic:cNvPr id="0" name="" descr=""/>
+                    <pic:cNvPicPr>
+                      <a:picLocks noChangeAspect="1" noChangeArrowheads="1"/>
+                    </pic:cNvPicPr>
+                  </pic:nvPicPr>
+                  <pic:blipFill>
+                    <a:blip r:embed="rId7" cstate="none"/>
+                    <a:srcRect/>
+                    <a:stretch>
+                      <a:fillRect/>
+                    </a:stretch>
+                  </pic:blipFill>
+                  <pic:spPr bwMode="auto">
+                    <a:xfrm>
+                      <a:off x="0" y="0"/>
+                      <a:ext cx="1047750" cy="1047750"/>
+                    </a:xfrm>
+                    <a:prstGeom prst="rect">
+                      <a:avLst/>
+                    </a:prstGeom>
+                  </pic:spPr>
+                </pic:pic>
+              </a:graphicData>
+            </a:graphic>
+          </wp:inline>
+        </w:drawing>
+      </w:r>
+    </w:p>
     <w:p>
       <w:pPr>
         <w:bidi/>

</xml_diff>

<commit_message>
Fix Salomon spelling and relocate Weinberg citation to tort liability point
Co-Authored-By: Claude Fable 5 <noreply@anthropic.com>
Claude-Session: https://claude.ai/code/session_012TmCDya3CoN4WHPLaKiBXc
</commit_message>
<xml_diff>
--- a/עבודת בית בדיני קניין.docx
+++ b/עבודת בית בדיני קניין.docx
@@ -190,7 +190,7 @@
           <w:szCs w:val="24"/>
           <w:rtl/>
         </w:rPr>
-        <w:t xml:space="preserve">אלא שהסעד אינו אוטומטי. הבעלות עצמה מסויגת בהוראה שאין בה "כדי להצדיק עשיית דבר הגורם נזק או אי נוחות לאחר" [ס' 14 לחוק המקרקעין], ועל השימוש בזכות הקניינית ובסעדיה חל עקרון תום הלב [ס' 39 ו-61(ב) לחוק החוזים (חלק כללי), תשל"ג-1973]. בעניין רוקר נקבע שבידי בית המשפט שיקול דעת שלא להורות על הריסה, אם כי שיקול דעת מצומצם השמור למקרים חריגים, ובמסגרתו נבחנות עוצמת הזכות הנפגעת, עוצמת הפגיעה בה, עוצמת התוצאות של הסרת הבנייה והתנהגות הצדדים [רע"א 6339/97 רוקר נ' סולומון, פ"ד נה(1) 199]. שיקול דעת דומה הופעל עוד קודם לכן כלפי תובע שתביעתו נגועה בחוסר תום לב [ע"א 782/70 רדומילסקי נ' פרידמן, פ"ד כה(2) 523], והמבחנים יושמו גם בסכסוכי בנייה בין שכנים בבית משותף [ע"א 8661/10 נעמה נ' טורקיה (נבו)].</w:t>
+        <w:t xml:space="preserve">אלא שהסעד אינו אוטומטי. הבעלות עצמה מסויגת בהוראה שאין בה "כדי להצדיק עשיית דבר הגורם נזק או אי נוחות לאחר" [ס' 14 לחוק המקרקעין], ועל השימוש בזכות הקניינית ובסעדיה חל עקרון תום הלב [ס' 39 ו-61(ב) לחוק החוזים (חלק כללי), תשל"ג-1973]. בעניין רוקר נקבע שבידי בית המשפט שיקול דעת שלא להורות על הריסה, אם כי שיקול דעת מצומצם השמור למקרים חריגים, ובמסגרתו נבחנות עוצמת הזכות הנפגעת, עוצמת הפגיעה בה, עוצמת התוצאות של הסרת הבנייה והתנהגות הצדדים [רע"א 6339/97 רוקר נ' סלומון, פ"ד נה(1) 199]. שיקול דעת דומה הופעל עוד קודם לכן כלפי תובע שתביעתו נגועה בחוסר תום לב [ע"א 782/70 רדומילסקי נ' פרידמן, פ"ד כה(2) 523], והמבחנים יושמו גם בסכסוכי בנייה בין שכנים בבית משותף [ע"א 8661/10 נעמה נ' טורקיה (נבו)].</w:t>
       </w:r>
     </w:p>
     <w:p>
@@ -300,7 +300,7 @@
           <w:szCs w:val="24"/>
           <w:rtl/>
         </w:rPr>
-        <w:t xml:space="preserve">לפנינו עסקאות נוגדות במקרקעין. ס' 9 לחוק המקרקעין מעניק עדיפות לבעל העסקה הראשונה בזמן (ניר), אלא אם כן השני התקשר בתמורה, פעל בתום לב, והעסקה לטובתו נרשמה. שירי שילמה תמורה ופעלה בתום לב, שכן בדקה נסח נקי, אך רשמה הערת אזהרה בלבד, ורישום הערה אינו "רישום" של העסקה המשכלל את החריג [ס' 9 לחוק המקרקעין; ע"א 9245/99 ויינברג נ' אריאן, פ"ד נח(4) 769]. לכאורה, אפוא, ידו של הראשון בזמן על העליונה.</w:t>
+        <w:t xml:space="preserve">לפנינו עסקאות נוגדות במקרקעין. ס' 9 לחוק המקרקעין מעניק עדיפות לבעל העסקה הראשונה בזמן (ניר), אלא אם כן השני התקשר בתמורה, פעל בתום לב, והעסקה לטובתו נרשמה. שירי שילמה תמורה ופעלה בתום לב, שכן בדקה נסח נקי, אך רשמה הערת אזהרה בלבד, ורישום הערה אינו "רישום" של העסקה המשכלל את החריג [ס' 9 לחוק המקרקעין]. לכאורה, אפוא, ידו של הראשון בזמן על העליונה.</w:t>
       </w:r>
     </w:p>
     <w:p>
@@ -336,7 +336,7 @@
           <w:szCs w:val="24"/>
           <w:rtl/>
         </w:rPr>
-        <w:t xml:space="preserve">ביישום: ניר לא רשם הערה במשך ארבעה חודשים, אך לא ישב בחיבוק ידיים; הוא הסתמך על התחייבות מפורשת של רונית לטפל ברישום מול עורך דינה, ובעיקר קיבל חזקה בפועל בדירה, מפתח וקבלן מטעמו המבצע בה שיפוצים. חזקה גלויה לעין היא תחליף פרסום ממשי, ושירי, שהסתפקה בנסח ולא ביקרה בדירה שרכשה בארבעה מיליון ש"ח, יכלה לגלות את העסקה הראשונה בבדיקה פשוטה. בנסיבות אלה מחדלו של ניר אינו הגורם המכריע לתאונה, ואשמה של שירי אינו נופל ממנו. מסקנתי: עדיפותו של ניר לפי ס' 9 תיוותר על כנה, הוא שילם את מלוא התמורה והבעלות תירשם על שמו, והערת האזהרה של שירי תימחק. שירי תיוותר עם תביעות השבה ופיצוי בגין תרמית נגד רונית, שערכן מוטל בספק משנעלמה. תביעת פיצוי של שירי נגד ניר עצמו, על יסוד הפרת חובת תום הלב שבעניין גנז, אינה נשללת עקרונית, אך נוכח אשמה השקול שלה סביר שתידחה. לחלופין, אם יראה בית המשפט במחדל הרישום של ניר את הגורם המכריע, תגבר שירי בכפוף להשלמת התמורה, וניר ייוותר עם תביעה נגד רונית על מלוא ששילם.</w:t>
+        <w:t xml:space="preserve">ביישום: ניר לא רשם הערה במשך ארבעה חודשים, אך לא ישב בחיבוק ידיים; הוא הסתמך על התחייבות מפורשת של רונית לטפל ברישום מול עורך דינה, ובעיקר קיבל חזקה בפועל בדירה, מפתח וקבלן מטעמו המבצע בה שיפוצים. חזקה גלויה לעין היא תחליף פרסום ממשי, ושירי, שהסתפקה בנסח ולא ביקרה בדירה שרכשה בארבעה מיליון ש"ח, יכלה לגלות את העסקה הראשונה בבדיקה פשוטה. בנסיבות אלה מחדלו של ניר אינו הגורם המכריע לתאונה, ואשמה של שירי אינו נופל ממנו. מסקנתי: עדיפותו של ניר לפי ס' 9 תיוותר על כנה, הוא שילם את מלוא התמורה והבעלות תירשם על שמו, והערת האזהרה של שירי תימחק. שירי תיוותר עם תביעות השבה ופיצוי בגין תרמית נגד רונית, שערכן מוטל בספק משנעלמה. תביעת פיצוי של שירי נגד ניר עצמו, בגין מחדל אי רישום ההערה, אפשרית עקרונית, שכן הפסיקה הכירה באפשרות של אחריות נזיקית של בעל העסקה הראשונה כלפי המתקשר המאוחר שהסתמך על העדר הרישום [ע"א 9245/99 ויינברג נ' אריאן, פ"ד נח(4) 769], אך נוכח אשמה השקול של שירי סביר שתידחה. לחלופין, אם יראה בית המשפט במחדל הרישום של ניר את הגורם המכריע, תגבר שירי בכפוף להשלמת התמורה, וניר ייוותר עם תביעה נגד רונית על מלוא ששילם.</w:t>
       </w:r>
     </w:p>
     <w:p>

</xml_diff>